<commit_message>
Move Claude from co-author block to Acknowledgments
Single-author paper now: Kyle Townsend (Independent). Analysis and
writing assistance from Claude (Anthropic) moved to a new
Acknowledgments section before References.

Reason: many peer-reviewed venues (Nature/Elsevier/Wiley/Springer/COPE
guidance, increasingly linguistics journals too) have explicit policies
that LLMs cannot be listed as authors because authors must take
responsibility for the work. Acknowledgments is the field-standard
portable credit for AI assistance.

Lingbuzz preprint accepts either format; moving now avoids a rewrite
before submission to Corpora, JQL, DSH, or similar.

Co-Authored-By: Claude Opus 4.6 (1M context) <noreply@anthropic.com>
</commit_message>
<xml_diff>
--- a/paper.docx
+++ b/paper.docx
@@ -28,14 +28,6 @@
       </w:pPr>
       <w:r>
         <w:t xml:space="preserve">Kyle Townsend</w:t>
-      </w:r>
-    </w:p>
-    <w:p>
-      <w:pPr>
-        <w:pStyle w:val="Author"/>
-      </w:pPr>
-      <w:r>
-        <w:t xml:space="preserve">Claude (analysis collaborator)</w:t>
       </w:r>
     </w:p>
     <w:p>
@@ -7735,7 +7727,7 @@
       </w:r>
     </w:p>
     <w:bookmarkEnd w:id="67"/>
-    <w:bookmarkStart w:id="72" w:name="conclusion"/>
+    <w:bookmarkStart w:id="68" w:name="conclusion"/>
     <w:p>
       <w:pPr>
         <w:pStyle w:val="Heading1"/>
@@ -7898,6 +7890,54 @@
         <w:t xml:space="preserve">features.</w:t>
       </w:r>
     </w:p>
+    <w:bookmarkEnd w:id="68"/>
+    <w:bookmarkStart w:id="73" w:name="acknowledgments"/>
+    <w:p>
+      <w:pPr>
+        <w:pStyle w:val="Heading1"/>
+      </w:pPr>
+      <w:r>
+        <w:t xml:space="preserve">Acknowledgments</w:t>
+      </w:r>
+    </w:p>
+    <w:p>
+      <w:pPr>
+        <w:pStyle w:val="FirstParagraph"/>
+      </w:pPr>
+      <w:r>
+        <w:t xml:space="preserve">Analysis and writing assistance, including implementation of the</w:t>
+      </w:r>
+      <w:r>
+        <w:t xml:space="preserve"> </w:t>
+      </w:r>
+      <w:r>
+        <w:t xml:space="preserve">schwa-density analyser, the function-word ablation, the</w:t>
+      </w:r>
+      <w:r>
+        <w:t xml:space="preserve"> </w:t>
+      </w:r>
+      <w:r>
+        <w:t xml:space="preserve">grapheme-to-phoneme fallback pipeline, and all four rounds of</w:t>
+      </w:r>
+      <w:r>
+        <w:t xml:space="preserve"> </w:t>
+      </w:r>
+      <w:r>
+        <w:t xml:space="preserve">peer-review response, was provided by Claude (Anthropic; model 4.6).</w:t>
+      </w:r>
+      <w:r>
+        <w:t xml:space="preserve"> </w:t>
+      </w:r>
+      <w:r>
+        <w:t xml:space="preserve">Claude’s contributions were reviewed and are owned by the human</w:t>
+      </w:r>
+      <w:r>
+        <w:t xml:space="preserve"> </w:t>
+      </w:r>
+      <w:r>
+        <w:t xml:space="preserve">author, who takes responsibility for the work.</w:t>
+      </w:r>
+    </w:p>
     <w:p>
       <w:pPr>
         <w:pStyle w:val="BodyText"/>
@@ -7984,7 +8024,7 @@
       <w:r>
         <w:t xml:space="preserve"> </w:t>
       </w:r>
-      <w:hyperlink r:id="rId68">
+      <w:hyperlink r:id="rId69">
         <w:r>
           <w:rPr>
             <w:rStyle w:val="Hyperlink"/>
@@ -8072,7 +8112,7 @@
       <w:r>
         <w:t xml:space="preserve"> </w:t>
       </w:r>
-      <w:hyperlink r:id="rId69">
+      <w:hyperlink r:id="rId70">
         <w:r>
           <w:rPr>
             <w:rStyle w:val="Hyperlink"/>
@@ -8139,7 +8179,7 @@
       <w:r>
         <w:t xml:space="preserve"> </w:t>
       </w:r>
-      <w:hyperlink r:id="rId70">
+      <w:hyperlink r:id="rId71">
         <w:r>
           <w:rPr>
             <w:rStyle w:val="Hyperlink"/>
@@ -8223,7 +8263,7 @@
       <w:r>
         <w:t xml:space="preserve"> </w:t>
       </w:r>
-      <w:hyperlink r:id="rId71">
+      <w:hyperlink r:id="rId72">
         <w:r>
           <w:rPr>
             <w:rStyle w:val="Hyperlink"/>
@@ -8301,7 +8341,7 @@
         <w:t xml:space="preserve">, 105, 14–26.</w:t>
       </w:r>
     </w:p>
-    <w:bookmarkEnd w:id="72"/>
+    <w:bookmarkEnd w:id="73"/>
     <w:sectPr/>
   </w:body>
 </w:document>

</xml_diff>